<commit_message>
feat: implement admin dashboard and sitpp integration
</commit_message>
<xml_diff>
--- a/template spt simona.docx
+++ b/template spt simona.docx
@@ -732,7 +732,7 @@
         <w:tab/>
         <w:t>:</w:t>
         <w:tab/>
-        <w:t xml:space="preserve">Menjadi Admin Pada Proses Rekonsiliasi TPP dan Aplikasi SIMONA </w:t>
+        <w:t>{{perihal}}</w:t>
       </w:r>
     </w:p>
     <w:p>
@@ -758,10 +758,6 @@
           <w:sz w:val="22"/>
           <w:szCs w:val="22"/>
         </w:rPr>
-        <w:tab/>
-        <w:tab/>
-        <w:tab/>
-        <w:t xml:space="preserve">Anjab Kemendagri </w:t>
       </w:r>
     </w:p>
     <w:p>

</xml_diff>